<commit_message>
Rebuild the tester manuals after the invitation change
`docs/13` now lists firstnameTh and lastnameTh as optional; the .docx files are
built from the Markdown, so they are rebuilt rather than edited by hand.

Co-Authored-By: Claude Opus 5 <noreply@anthropic.com>
Claude-Session: https://claude.ai/code/session_01YbqGw8Te9YQE73qpuvqhVf
</commit_message>
<xml_diff>
--- a/docs/manuals-docx/13-tester-manual-journey-a.docx
+++ b/docs/manuals-docx/13-tester-manual-journey-a.docx
@@ -3183,32 +3183,12 @@
             <w:r/>
             <w:r>
               <w:rPr>
-                <w:rFonts w:ascii="DejaVu Sans" w:hAnsi="DejaVu Sans" w:cs="DejaVu Sans" w:eastAsia="DejaVu Sans"/>
-                <w:color w:val="1A1E33"/>
-                <w:sz w:val="20"/>
-                <w:szCs w:val="20"/>
-              </w:rPr>
-              <w:t>✔</w:t>
-            </w:r>
-            <w:r>
-              <w:rPr>
                 <w:rFonts w:ascii="Sarabun" w:hAnsi="Sarabun" w:cs="Sarabun" w:eastAsia="Sarabun"/>
                 <w:color w:val="1A1E33"/>
                 <w:sz w:val="20"/>
                 <w:szCs w:val="20"/>
               </w:rPr>
-              <w:t xml:space="preserve"> </w:t>
-            </w:r>
-            <w:r>
-              <w:rPr>
-                <w:rFonts w:ascii="Sarabun" w:hAnsi="Sarabun" w:cs="Sarabun" w:eastAsia="Sarabun"/>
-                <w:color w:val="1A1E33"/>
-                <w:sz w:val="20"/>
-                <w:szCs w:val="20"/>
-                <w:b w:val="1"/>
-                <w:bCs w:val="1"/>
-              </w:rPr>
-              <w:t>ทุกบทบาท</w:t>
+              <w:t>ไม่บังคับ</w:t>
             </w:r>
           </w:p>
         </w:tc>
@@ -3230,7 +3210,7 @@
                 <w:sz w:val="20"/>
                 <w:szCs w:val="20"/>
               </w:rPr>
-              <w:t>ชื่อจริงตามเอกสารที่หน่วยงานส่งมา · เอกสาร A0–A3 ใช้ชื่อนี้ ไม่ใช่ชื่อที่แสดง</w:t>
+              <w:t>ชื่อจริงตามเอกสารที่หน่วยงานส่งมา · ส่งมาก็ถูกนำไปเติมให้ในฟอร์มเปิดใช้งาน ไม่ส่งมาผู้ถูกเชิญกรอกเองตอนเปิดใช้งาน (ซึ่งยังบังคับกรอก)</w:t>
             </w:r>
           </w:p>
         </w:tc>
@@ -3275,32 +3255,12 @@
             <w:r/>
             <w:r>
               <w:rPr>
-                <w:rFonts w:ascii="DejaVu Sans" w:hAnsi="DejaVu Sans" w:cs="DejaVu Sans" w:eastAsia="DejaVu Sans"/>
-                <w:color w:val="1A1E33"/>
-                <w:sz w:val="20"/>
-                <w:szCs w:val="20"/>
-              </w:rPr>
-              <w:t>✔</w:t>
-            </w:r>
-            <w:r>
-              <w:rPr>
                 <w:rFonts w:ascii="Sarabun" w:hAnsi="Sarabun" w:cs="Sarabun" w:eastAsia="Sarabun"/>
                 <w:color w:val="1A1E33"/>
                 <w:sz w:val="20"/>
                 <w:szCs w:val="20"/>
               </w:rPr>
-              <w:t xml:space="preserve"> </w:t>
-            </w:r>
-            <w:r>
-              <w:rPr>
-                <w:rFonts w:ascii="Sarabun" w:hAnsi="Sarabun" w:cs="Sarabun" w:eastAsia="Sarabun"/>
-                <w:color w:val="1A1E33"/>
-                <w:sz w:val="20"/>
-                <w:szCs w:val="20"/>
-                <w:b w:val="1"/>
-                <w:bCs w:val="1"/>
-              </w:rPr>
-              <w:t>ทุกบทบาท</w:t>
+              <w:t>ไม่บังคับ</w:t>
             </w:r>
           </w:p>
         </w:tc>
@@ -3322,7 +3282,7 @@
                 <w:sz w:val="20"/>
                 <w:szCs w:val="20"/>
               </w:rPr>
-              <w:t>นามสกุลจริง</w:t>
+              <w:t>นามสกุลจริง · เงื่อนไขเดียวกับช่องบน</w:t>
             </w:r>
           </w:p>
         </w:tc>

</xml_diff>